<commit_message>
Connect PSD measurement to Arduino ADC inputs
</commit_message>
<xml_diff>
--- a/基于光杠杆放大的微弱电信号测量系统设计与实现.docx
+++ b/基于光杠杆放大的微弱电信号测量系统设计与实现.docx
@@ -260,15 +260,15 @@
           <w:highlight w:val="none"/>
         </w:rPr>
       </w:pPr>
-      <w:bookmarkStart w:id="0" w:name="_Toc1883703314"/>
+      <w:bookmarkStart w:id="0" w:name="_Toc1991001916"/>
       <w:bookmarkStart w:id="1" w:name="_Toc1096625292"/>
-      <w:bookmarkStart w:id="2" w:name="_Toc1991001916"/>
-      <w:bookmarkStart w:id="3" w:name="_Toc326216493"/>
-      <w:bookmarkStart w:id="4" w:name="_Toc2064958417"/>
-      <w:bookmarkStart w:id="5" w:name="_Toc635742631"/>
-      <w:bookmarkStart w:id="6" w:name="_Toc449994352"/>
-      <w:bookmarkStart w:id="7" w:name="_Toc1143462373"/>
-      <w:bookmarkStart w:id="8" w:name="_Toc1709472451"/>
+      <w:bookmarkStart w:id="2" w:name="_Toc2064958417"/>
+      <w:bookmarkStart w:id="3" w:name="_Toc1709472451"/>
+      <w:bookmarkStart w:id="4" w:name="_Toc1143462373"/>
+      <w:bookmarkStart w:id="5" w:name="_Toc449994352"/>
+      <w:bookmarkStart w:id="6" w:name="_Toc1883703314"/>
+      <w:bookmarkStart w:id="7" w:name="_Toc635742631"/>
+      <w:bookmarkStart w:id="8" w:name="_Toc326216493"/>
       <w:r>
         <w:rPr>
           <w:rFonts w:hint="eastAsia" w:ascii="黑体" w:hAnsi="黑体" w:eastAsia="黑体"/>
@@ -454,16 +454,16 @@
           <w:lang w:val="en-US" w:eastAsia="zh-CN"/>
         </w:rPr>
       </w:pPr>
-      <w:bookmarkStart w:id="9" w:name="_Toc206624724"/>
-      <w:bookmarkStart w:id="10" w:name="_Toc1095339306"/>
-      <w:bookmarkStart w:id="11" w:name="_Toc793186260"/>
-      <w:bookmarkStart w:id="12" w:name="_Toc29949001"/>
-      <w:bookmarkStart w:id="13" w:name="_Toc471256848"/>
+      <w:bookmarkStart w:id="9" w:name="_Toc948140137"/>
+      <w:bookmarkStart w:id="10" w:name="_Toc206624724"/>
+      <w:bookmarkStart w:id="11" w:name="_Toc1586984781"/>
+      <w:bookmarkStart w:id="12" w:name="_Toc2029459392"/>
+      <w:bookmarkStart w:id="13" w:name="_Toc29949001"/>
       <w:bookmarkStart w:id="14" w:name="_Toc711963453"/>
-      <w:bookmarkStart w:id="15" w:name="_Toc1674594719"/>
-      <w:bookmarkStart w:id="16" w:name="_Toc948140137"/>
-      <w:bookmarkStart w:id="17" w:name="_Toc2029459392"/>
-      <w:bookmarkStart w:id="18" w:name="_Toc1586984781"/>
+      <w:bookmarkStart w:id="15" w:name="_Toc471256848"/>
+      <w:bookmarkStart w:id="16" w:name="_Toc1674594719"/>
+      <w:bookmarkStart w:id="17" w:name="_Toc793186260"/>
+      <w:bookmarkStart w:id="18" w:name="_Toc1095339306"/>
       <w:r>
         <w:rPr>
           <w:rFonts w:hint="eastAsia" w:ascii="黑体" w:hAnsi="黑体" w:eastAsia="黑体"/>
@@ -3990,9 +3990,9 @@
         <w:br w:type="page"/>
       </w:r>
       <w:bookmarkStart w:id="22" w:name="_Toc17858"/>
-      <w:bookmarkStart w:id="23" w:name="_Toc533261391"/>
+      <w:bookmarkStart w:id="23" w:name="_Toc15020_WPSOffice_Level2"/>
       <w:bookmarkStart w:id="24" w:name="_Toc532872738"/>
-      <w:bookmarkStart w:id="25" w:name="_Toc15020_WPSOffice_Level2"/>
+      <w:bookmarkStart w:id="25" w:name="_Toc533261391"/>
       <w:bookmarkStart w:id="26" w:name="_Toc19851_WPSOffice_Level2"/>
       <w:bookmarkStart w:id="27" w:name="_Toc152619889"/>
       <w:bookmarkStart w:id="28" w:name="_Toc32753_WPSOffice_Level2"/>
@@ -6825,10 +6825,10 @@
           <w:lang w:val="en-US" w:eastAsia="zh-CN"/>
         </w:rPr>
       </w:pPr>
-      <w:bookmarkStart w:id="29" w:name="_Toc1339668345"/>
+      <w:bookmarkStart w:id="29" w:name="_Toc485224738"/>
       <w:bookmarkStart w:id="30" w:name="_Toc557541547"/>
-      <w:bookmarkStart w:id="31" w:name="_Toc1817611038"/>
-      <w:bookmarkStart w:id="32" w:name="_Toc485224738"/>
+      <w:bookmarkStart w:id="31" w:name="_Toc1339668345"/>
+      <w:bookmarkStart w:id="32" w:name="_Toc1817611038"/>
       <w:r>
         <w:rPr>
           <w:rStyle w:val="32"/>
@@ -6922,19 +6922,7 @@
           <w:highlight w:val="none"/>
           <w:lang w:val="en-US" w:eastAsia="zh-CN"/>
         </w:rPr>
-        <w:t>一直存在</w:t>
-      </w:r>
-      <w:bookmarkStart w:id="179" w:name="_GoBack"/>
-      <w:bookmarkEnd w:id="179"/>
-      <w:r>
-        <w:rPr>
-          <w:rFonts w:hint="eastAsia" w:cs="Times New Roman"/>
-          <w:color w:val="auto"/>
-          <w:sz w:val="24"/>
-          <w:highlight w:val="none"/>
-          <w:lang w:val="en-US" w:eastAsia="zh-CN"/>
-        </w:rPr>
-        <w:t>困难</w:t>
+        <w:t>一直存在困难</w:t>
       </w:r>
       <w:r>
         <w:rPr>
@@ -7465,10 +7453,10 @@
           <w:lang w:val="en-US" w:eastAsia="zh-CN"/>
         </w:rPr>
       </w:pPr>
-      <w:bookmarkStart w:id="33" w:name="_Toc633837091"/>
-      <w:bookmarkStart w:id="34" w:name="_Toc1587319267"/>
-      <w:bookmarkStart w:id="35" w:name="_Toc1176763907"/>
-      <w:bookmarkStart w:id="36" w:name="_Toc1129628568"/>
+      <w:bookmarkStart w:id="33" w:name="_Toc1129628568"/>
+      <w:bookmarkStart w:id="34" w:name="_Toc1176763907"/>
+      <w:bookmarkStart w:id="35" w:name="_Toc1587319267"/>
+      <w:bookmarkStart w:id="36" w:name="_Toc633837091"/>
       <w:r>
         <w:rPr>
           <w:rStyle w:val="32"/>
@@ -8044,8 +8032,8 @@
         </w:rPr>
       </w:pPr>
       <w:bookmarkStart w:id="37" w:name="_Toc360603249"/>
-      <w:bookmarkStart w:id="38" w:name="_Toc1694079726"/>
-      <w:bookmarkStart w:id="39" w:name="_Toc782151330"/>
+      <w:bookmarkStart w:id="38" w:name="_Toc782151330"/>
+      <w:bookmarkStart w:id="39" w:name="_Toc1694079726"/>
       <w:r>
         <w:rPr>
           <w:rStyle w:val="32"/>
@@ -11115,8 +11103,8 @@
         </w:rPr>
       </w:pPr>
       <w:bookmarkStart w:id="47" w:name="_Toc1115880652"/>
-      <w:bookmarkStart w:id="48" w:name="_Toc2108151585"/>
-      <w:bookmarkStart w:id="49" w:name="_Toc1018073446"/>
+      <w:bookmarkStart w:id="48" w:name="_Toc1018073446"/>
+      <w:bookmarkStart w:id="49" w:name="_Toc2108151585"/>
       <w:r>
         <w:rPr>
           <w:rStyle w:val="32"/>
@@ -12650,8 +12638,8 @@
           <w:lang w:val="en-US" w:eastAsia="zh-CN"/>
         </w:rPr>
       </w:pPr>
-      <w:bookmarkStart w:id="50" w:name="_Toc545742591"/>
-      <w:bookmarkStart w:id="51" w:name="_Toc370997242"/>
+      <w:bookmarkStart w:id="50" w:name="_Toc370997242"/>
+      <w:bookmarkStart w:id="51" w:name="_Toc545742591"/>
       <w:bookmarkStart w:id="52" w:name="_Toc1709040964"/>
       <w:r>
         <w:rPr>
@@ -15064,7 +15052,7 @@
           <w:sz w:val="24"/>
           <w:lang w:val="en-US" w:eastAsia="zh-CN"/>
         </w:rPr>
-        <w:t>数据处理模块负责完成光电信号采集、信号调理、模数转换以及数据计算，是整个测量系统实现数字化输出的核心部分。由于系统通过PSD检测反射激光光斑位置变化，而PSD输出信号本质上为微弱光电流，无法直接被数字控制单元读取，因此需要经过电流转换、模拟调理以及高精度采样后，才能完成后续数据分析。本系统采用“PSD传感器、低噪声信号调理电路、ADS1115高精度模数转换模块以及Arduino控制单元”的结构，实现从光斑位置变化到数字测量结果输出的转换。</w:t>
+        <w:t>数数据处理模块负责完成光电信号采集、信号调理、模数转换以及数据计算，是整个测量系统实现数字化输出的核心部分。由于系统通过PSD检测反射激光光斑位置变化，而PSD输出信号本质上为微弱光电流，无法直接被数字控制单元读取，因此需要经过电流转换、模拟调理以及高精度采样后，才能进行后续数据分析。本系统采用“PSD传感器、低噪声信号调理电路、ADS1115高精度模数转换模块以及Arduino控制单元”的结构，实现从光斑位置变化到数字测量结果输出的转换。</w:t>
       </w:r>
     </w:p>
     <w:p>
@@ -15085,7 +15073,7 @@
           <w:sz w:val="24"/>
           <w:lang w:val="en-US" w:eastAsia="zh-CN"/>
         </w:rPr>
-        <w:t>数据处理模块主要由PSD传感器、AD8628信号调理电路、ADS1115模数转换模块以及Arduino控制单元组成。其中，PSD作为光斑位置检测器件，用于检测反射激光在感光区域上的位置变化。当偏转线圈带动反射镜发生微小转动时，激光反射方向随之改变，使光斑在PSD感光面上产生位移。PSD利用横向光电效应，根据光斑在感光区域上的能量分布变化产生两路差分光电流输出信号，分别对应PSD两个位置检测电极的输出端。</w:t>
+        <w:t>数据处理模块主要由PSD传感器、AD8628信号调理电路、ADS1115模数转换模块以及Arduino控制单元组成。其中，PSD作为光斑位置检测器件，用于检测反射激光在感光区域上的位置变化。当偏转线圈带动反射镜发生微小转动时，激光反射方向随之改变，使光斑在PSD感光面上产生位移。PSD利用横向光电效应，根据光斑能量分布变化产生两路差分光电流输出信号，分别对应两个位置检测电极。</w:t>
       </w:r>
     </w:p>
     <w:p>
@@ -15106,7 +15094,7 @@
           <w:sz w:val="24"/>
           <w:lang w:val="en-US" w:eastAsia="zh-CN"/>
         </w:rPr>
-        <w:t>由于PSD输出信号为微弱电流信号，无法直接输入模数转换模块，因此系统首先利用AD8628构成跨阻放大电路进行电流电压转换。PSD的两个电流输出端分别连接至两路AD8628运算放大电路的输入端，通过反馈电阻将光电流转换为对应的模拟电压信号。经过转换后，两路输出电压分别表示PSD两个检测区域接收到的光强变化信息。通过分别处理PSD两路输出信号，可以保留光斑位置变化过程中两侧光电流的比例关系，为后续位置计算提供数据基础。</w:t>
+        <w:t>由于PSD输出信号为微弱电流信号，无法直接输入模数转换模块，因此系统采用AD8628构成跨阻放大电路，将光电流转换为模拟电压信号。PSD两个电流输出端分别连接至两路AD8628运算放大电路输入端，通过反馈电阻完成电流-电压转换。转换后的两路输出电压分别反映PSD两个检测区域接收到的光强变化信息，并保留光斑移动过程中两侧光电流的比例关系，为后续位置计算提供数据基础。</w:t>
       </w:r>
     </w:p>
     <w:p>
@@ -15127,49 +15115,12 @@
           <w:sz w:val="24"/>
           <w:lang w:val="en-US" w:eastAsia="zh-CN"/>
         </w:rPr>
-        <w:t>AD8628具有低输入偏置电流和低失调电压特性，能够降低微弱光电流转换过程中的误差，提高前端检测电路的稳定性。经过AD8628调理后的两路模拟电压信号分别连接至ADS1115的两个模拟输入通道，其中一路连接至ADS1115的A0通道，另一路连接至A1通道。ADS1115负责完成两路模拟电压信号的高精度模数转换，并通过I2C通信接口与Arduino控制单元连接。本系统采用ADS1115的16位采样模式进行数据采集，通过配置可编程增益放大器（PGA）提高低幅模拟信号的有效分辨能力。采样数据通过I2C总线传输至Arduino控制单元，随后完成归一化计算、数字滤波以及测量参数转换。数据处理模块的电路结构和原理如下图</w:t>
-      </w:r>
-      <w:r>
-        <w:rPr>
-          <w:rFonts w:hint="eastAsia" w:hAnsi="DejaVu Math TeX Gyre"/>
-          <w:i w:val="0"/>
-          <w:sz w:val="24"/>
-          <w:lang w:val="en-US" w:eastAsia="zh-CN"/>
-        </w:rPr>
-        <w:t>8</w:t>
-      </w:r>
-      <w:r>
-        <w:rPr>
-          <w:rFonts w:hint="eastAsia" w:hAnsi="DejaVu Math TeX Gyre" w:eastAsia="宋体"/>
-          <w:i w:val="0"/>
-          <w:sz w:val="24"/>
-          <w:lang w:val="en-US" w:eastAsia="zh-CN"/>
-        </w:rPr>
-        <w:t>与图</w:t>
-      </w:r>
-      <w:r>
-        <w:rPr>
-          <w:rFonts w:hint="eastAsia" w:hAnsi="DejaVu Math TeX Gyre"/>
-          <w:i w:val="0"/>
-          <w:sz w:val="24"/>
-          <w:lang w:val="en-US" w:eastAsia="zh-CN"/>
-        </w:rPr>
-        <w:t>9</w:t>
-      </w:r>
-      <w:r>
-        <w:rPr>
-          <w:rFonts w:hint="eastAsia" w:hAnsi="DejaVu Math TeX Gyre" w:eastAsia="宋体"/>
-          <w:i w:val="0"/>
-          <w:sz w:val="24"/>
-          <w:lang w:val="en-US" w:eastAsia="zh-CN"/>
-        </w:rPr>
-        <w:t>所示。</w:t>
-      </w:r>
-    </w:p>
-    <w:p>
-      <w:pPr>
-        <w:spacing w:line="360" w:lineRule="auto"/>
-        <w:ind w:firstLine="480" w:firstLineChars="200"/>
+        <w:t>AD8628具有低输入偏置电流和低失调电压特性，可降低微弱光电流转换过程中的误差，提高检测电路稳定性。经过调理后的两路模拟电压信号分别连接至ADS1115的A0和A1模拟输入通道。ADS1115负责完成高精度模数转换，并通过I2C接口与Arduino控制单元通信。本系统采用ADS1115 16位采样模式，并通过配置可编程增益放大器（PGA）提高低幅模拟信号的分辨能力。采样数据经I2C总线传输至Arduino后，完成归一化计算、数字滤波以及测量参数转换。数据处理模块的电路结构和原理如下图8与图9所示。</w:t>
+      </w:r>
+    </w:p>
+    <w:p>
+      <w:pPr>
+        <w:spacing w:line="360" w:lineRule="auto"/>
         <w:rPr>
           <w:rFonts w:hint="eastAsia" w:hAnsi="DejaVu Math TeX Gyre" w:eastAsia="宋体"/>
           <w:i w:val="0"/>
@@ -15685,10 +15636,10 @@
           <w:lang w:val="en-US" w:eastAsia="zh-CN"/>
         </w:rPr>
       </w:pPr>
-      <w:bookmarkStart w:id="58" w:name="_Toc2118569585"/>
-      <w:bookmarkStart w:id="59" w:name="_Toc531996516"/>
-      <w:bookmarkStart w:id="60" w:name="_Toc661655261"/>
-      <w:bookmarkStart w:id="61" w:name="_Toc885498195"/>
+      <w:bookmarkStart w:id="58" w:name="_Toc885498195"/>
+      <w:bookmarkStart w:id="59" w:name="_Toc661655261"/>
+      <w:bookmarkStart w:id="60" w:name="_Toc531996516"/>
+      <w:bookmarkStart w:id="61" w:name="_Toc2118569585"/>
       <w:r>
         <w:rPr>
           <w:rStyle w:val="32"/>
@@ -16582,9 +16533,9 @@
           <w:lang w:val="en-US" w:eastAsia="zh-CN"/>
         </w:rPr>
       </w:pPr>
-      <w:bookmarkStart w:id="68" w:name="_Toc206633274"/>
-      <w:bookmarkStart w:id="69" w:name="_Toc200749676"/>
-      <w:bookmarkStart w:id="70" w:name="_Toc1722783714"/>
+      <w:bookmarkStart w:id="68" w:name="_Toc200749676"/>
+      <w:bookmarkStart w:id="69" w:name="_Toc1722783714"/>
+      <w:bookmarkStart w:id="70" w:name="_Toc206633274"/>
       <w:bookmarkStart w:id="71" w:name="_Toc511714486"/>
       <w:r>
         <w:rPr>
@@ -19699,6 +19650,8 @@
         <w:t>测量精度提升策略</w:t>
       </w:r>
       <w:bookmarkEnd w:id="99"/>
+      <w:bookmarkStart w:id="179" w:name="_GoBack"/>
+      <w:bookmarkEnd w:id="179"/>
     </w:p>
     <w:p>
       <w:pPr>
@@ -19786,9 +19739,35 @@
         </w:rPr>
         <w:t>在系统运行过程中，还需要建立规范化的校准流程。实验开始前应完成光路调整和零点校准，并在长时间测量过程中定期检查系统基准状态，以减少温度变化、器件老化以及环境变化造成的长期漂移。通过上述优化措施，可以进一步提高系统测量精度和长期稳定性。</w:t>
       </w:r>
-      <w:bookmarkStart w:id="100" w:name="_Toc1330000403"/>
+      <w:bookmarkStart w:id="100" w:name="_Toc832526828"/>
       <w:bookmarkStart w:id="101" w:name="_Toc1758232525"/>
-      <w:bookmarkStart w:id="102" w:name="_Toc832526828"/>
+      <w:bookmarkStart w:id="102" w:name="_Toc1330000403"/>
+    </w:p>
+    <w:p>
+      <w:pPr>
+        <w:rPr>
+          <w:rStyle w:val="32"/>
+          <w:rFonts w:hint="eastAsia" w:ascii="Times New Roman" w:hAnsi="Times New Roman" w:eastAsia="黑体" w:cs="Times New Roman"/>
+          <w:color w:val="auto"/>
+          <w:sz w:val="32"/>
+          <w:szCs w:val="32"/>
+          <w:highlight w:val="none"/>
+          <w:lang w:val="en-US" w:eastAsia="zh-CN"/>
+        </w:rPr>
+      </w:pPr>
+      <w:bookmarkStart w:id="103" w:name="_Toc1650330709"/>
+      <w:r>
+        <w:rPr>
+          <w:rStyle w:val="32"/>
+          <w:rFonts w:hint="eastAsia" w:ascii="Times New Roman" w:hAnsi="Times New Roman" w:eastAsia="黑体" w:cs="Times New Roman"/>
+          <w:color w:val="auto"/>
+          <w:sz w:val="32"/>
+          <w:szCs w:val="32"/>
+          <w:highlight w:val="none"/>
+          <w:lang w:val="en-US" w:eastAsia="zh-CN"/>
+        </w:rPr>
+        <w:br w:type="page"/>
+      </w:r>
     </w:p>
     <w:p>
       <w:pPr>
@@ -19810,7 +19789,6 @@
           <w:lang w:val="en-US" w:eastAsia="zh-CN"/>
         </w:rPr>
       </w:pPr>
-      <w:bookmarkStart w:id="103" w:name="_Toc1650330709"/>
       <w:r>
         <w:rPr>
           <w:rStyle w:val="32"/>
@@ -19934,10 +19912,10 @@
           <w:lang w:val="en-US" w:eastAsia="zh-CN"/>
         </w:rPr>
       </w:pPr>
-      <w:bookmarkStart w:id="105" w:name="_Toc357777944"/>
+      <w:bookmarkStart w:id="105" w:name="_Toc2136198492"/>
       <w:bookmarkStart w:id="106" w:name="_Toc523663188"/>
       <w:bookmarkStart w:id="107" w:name="_Toc1445100690"/>
-      <w:bookmarkStart w:id="108" w:name="_Toc2136198492"/>
+      <w:bookmarkStart w:id="108" w:name="_Toc357777944"/>
       <w:r>
         <w:rPr>
           <w:rStyle w:val="32"/>
@@ -20165,8 +20143,8 @@
           <w:lang w:val="en-US" w:eastAsia="zh-CN"/>
         </w:rPr>
       </w:pPr>
-      <w:bookmarkStart w:id="109" w:name="_Toc1456444498"/>
-      <w:bookmarkStart w:id="110" w:name="_Toc819215310"/>
+      <w:bookmarkStart w:id="109" w:name="_Toc819215310"/>
+      <w:bookmarkStart w:id="110" w:name="_Toc1456444498"/>
       <w:bookmarkStart w:id="111" w:name="_Toc1914732907"/>
       <w:bookmarkStart w:id="112" w:name="_Toc219693208"/>
       <w:r>
@@ -22605,8 +22583,8 @@
           <w:lang w:val="en-US" w:eastAsia="zh-CN"/>
         </w:rPr>
       </w:pPr>
-      <w:bookmarkStart w:id="151" w:name="_Toc49602244"/>
-      <w:bookmarkStart w:id="152" w:name="_Toc193542254"/>
+      <w:bookmarkStart w:id="151" w:name="_Toc193542254"/>
+      <w:bookmarkStart w:id="152" w:name="_Toc49602244"/>
       <w:bookmarkStart w:id="153" w:name="_Toc370513490"/>
       <w:bookmarkStart w:id="154" w:name="_Toc1614955126"/>
       <w:r>
@@ -22636,9 +22614,9 @@
           <w:lang w:val="en-US" w:eastAsia="zh-CN"/>
         </w:rPr>
       </w:pPr>
-      <w:bookmarkStart w:id="155" w:name="_Toc441259872"/>
-      <w:bookmarkStart w:id="156" w:name="_Toc1574421420"/>
-      <w:bookmarkStart w:id="157" w:name="_Toc1665133777"/>
+      <w:bookmarkStart w:id="155" w:name="_Toc1665133777"/>
+      <w:bookmarkStart w:id="156" w:name="_Toc441259872"/>
+      <w:bookmarkStart w:id="157" w:name="_Toc1574421420"/>
       <w:bookmarkStart w:id="158" w:name="_Toc504988249"/>
       <w:r>
         <w:rPr>
@@ -22766,10 +22744,10 @@
           <w:lang w:val="en-US" w:eastAsia="zh-CN"/>
         </w:rPr>
       </w:pPr>
-      <w:bookmarkStart w:id="163" w:name="_Toc2123982062"/>
-      <w:bookmarkStart w:id="164" w:name="_Toc412366163"/>
+      <w:bookmarkStart w:id="163" w:name="_Toc412366163"/>
+      <w:bookmarkStart w:id="164" w:name="_Toc669479062"/>
       <w:bookmarkStart w:id="165" w:name="_Toc1200908619"/>
-      <w:bookmarkStart w:id="166" w:name="_Toc669479062"/>
+      <w:bookmarkStart w:id="166" w:name="_Toc2123982062"/>
       <w:r>
         <w:rPr>
           <w:rFonts w:hint="eastAsia" w:ascii="Times New Roman" w:hAnsi="Times New Roman" w:eastAsia="黑体" w:cs="Times New Roman"/>
@@ -22829,9 +22807,9 @@
           <w:lang w:val="en-US" w:eastAsia="zh-CN"/>
         </w:rPr>
       </w:pPr>
-      <w:bookmarkStart w:id="167" w:name="_Toc1267768401"/>
-      <w:bookmarkStart w:id="168" w:name="_Toc1619845027"/>
-      <w:bookmarkStart w:id="169" w:name="_Toc145851953"/>
+      <w:bookmarkStart w:id="167" w:name="_Toc1619845027"/>
+      <w:bookmarkStart w:id="168" w:name="_Toc145851953"/>
+      <w:bookmarkStart w:id="169" w:name="_Toc1267768401"/>
       <w:bookmarkStart w:id="170" w:name="_Toc708372672"/>
       <w:r>
         <w:rPr>
@@ -22893,8 +22871,8 @@
         </w:rPr>
       </w:pPr>
       <w:bookmarkStart w:id="171" w:name="_Toc50770073"/>
-      <w:bookmarkStart w:id="172" w:name="_Toc2117642983"/>
-      <w:bookmarkStart w:id="173" w:name="_Toc1085175770"/>
+      <w:bookmarkStart w:id="172" w:name="_Toc1085175770"/>
+      <w:bookmarkStart w:id="173" w:name="_Toc2117642983"/>
       <w:bookmarkStart w:id="174" w:name="_Toc1054932844"/>
       <w:r>
         <w:rPr>
@@ -22937,8 +22915,8 @@
           <w:lang w:val="en-US" w:eastAsia="zh-CN"/>
         </w:rPr>
       </w:pPr>
-      <w:bookmarkStart w:id="175" w:name="_Toc2118036066"/>
-      <w:bookmarkStart w:id="176" w:name="_Toc631319476"/>
+      <w:bookmarkStart w:id="175" w:name="_Toc631319476"/>
+      <w:bookmarkStart w:id="176" w:name="_Toc2118036066"/>
       <w:bookmarkStart w:id="177" w:name="_Toc979133550"/>
       <w:bookmarkStart w:id="178" w:name="_Toc741609052"/>
       <w:r>

</xml_diff>

<commit_message>
chore: keep local media out of git
</commit_message>
<xml_diff>
--- a/基于光杠杆放大的微弱电信号测量系统设计与实现.docx
+++ b/基于光杠杆放大的微弱电信号测量系统设计与实现.docx
@@ -260,15 +260,15 @@
           <w:highlight w:val="none"/>
         </w:rPr>
       </w:pPr>
-      <w:bookmarkStart w:id="0" w:name="_Toc326216493"/>
-      <w:bookmarkStart w:id="1" w:name="_Toc635742631"/>
-      <w:bookmarkStart w:id="2" w:name="_Toc1143462373"/>
-      <w:bookmarkStart w:id="3" w:name="_Toc1883703314"/>
+      <w:bookmarkStart w:id="0" w:name="_Toc635742631"/>
+      <w:bookmarkStart w:id="1" w:name="_Toc1143462373"/>
+      <w:bookmarkStart w:id="2" w:name="_Toc1991001916"/>
+      <w:bookmarkStart w:id="3" w:name="_Toc1709472451"/>
       <w:bookmarkStart w:id="4" w:name="_Toc449994352"/>
-      <w:bookmarkStart w:id="5" w:name="_Toc1709472451"/>
-      <w:bookmarkStart w:id="6" w:name="_Toc2064958417"/>
-      <w:bookmarkStart w:id="7" w:name="_Toc1096625292"/>
-      <w:bookmarkStart w:id="8" w:name="_Toc1991001916"/>
+      <w:bookmarkStart w:id="5" w:name="_Toc1883703314"/>
+      <w:bookmarkStart w:id="6" w:name="_Toc1096625292"/>
+      <w:bookmarkStart w:id="7" w:name="_Toc2064958417"/>
+      <w:bookmarkStart w:id="8" w:name="_Toc326216493"/>
       <w:r>
         <w:rPr>
           <w:rFonts w:hint="eastAsia" w:ascii="黑体" w:hAnsi="黑体" w:eastAsia="黑体"/>
@@ -454,16 +454,16 @@
           <w:lang w:val="en-US" w:eastAsia="zh-CN"/>
         </w:rPr>
       </w:pPr>
-      <w:bookmarkStart w:id="9" w:name="_Toc711963453"/>
-      <w:bookmarkStart w:id="10" w:name="_Toc471256848"/>
-      <w:bookmarkStart w:id="11" w:name="_Toc1095339306"/>
-      <w:bookmarkStart w:id="12" w:name="_Toc1674594719"/>
-      <w:bookmarkStart w:id="13" w:name="_Toc793186260"/>
-      <w:bookmarkStart w:id="14" w:name="_Toc2029459392"/>
-      <w:bookmarkStart w:id="15" w:name="_Toc1586984781"/>
-      <w:bookmarkStart w:id="16" w:name="_Toc206624724"/>
-      <w:bookmarkStart w:id="17" w:name="_Toc948140137"/>
-      <w:bookmarkStart w:id="18" w:name="_Toc29949001"/>
+      <w:bookmarkStart w:id="9" w:name="_Toc948140137"/>
+      <w:bookmarkStart w:id="10" w:name="_Toc1095339306"/>
+      <w:bookmarkStart w:id="11" w:name="_Toc711963453"/>
+      <w:bookmarkStart w:id="12" w:name="_Toc29949001"/>
+      <w:bookmarkStart w:id="13" w:name="_Toc471256848"/>
+      <w:bookmarkStart w:id="14" w:name="_Toc793186260"/>
+      <w:bookmarkStart w:id="15" w:name="_Toc2029459392"/>
+      <w:bookmarkStart w:id="16" w:name="_Toc1674594719"/>
+      <w:bookmarkStart w:id="17" w:name="_Toc1586984781"/>
+      <w:bookmarkStart w:id="18" w:name="_Toc206624724"/>
       <w:r>
         <w:rPr>
           <w:rFonts w:hint="eastAsia" w:ascii="黑体" w:hAnsi="黑体" w:eastAsia="黑体"/>
@@ -3990,12 +3990,12 @@
         <w:br w:type="page"/>
       </w:r>
       <w:bookmarkStart w:id="22" w:name="_Toc17858"/>
-      <w:bookmarkStart w:id="23" w:name="_Toc15020_WPSOffice_Level2"/>
-      <w:bookmarkStart w:id="24" w:name="_Toc532872738"/>
-      <w:bookmarkStart w:id="25" w:name="_Toc533261391"/>
-      <w:bookmarkStart w:id="26" w:name="_Toc19851_WPSOffice_Level2"/>
-      <w:bookmarkStart w:id="27" w:name="_Toc152619889"/>
-      <w:bookmarkStart w:id="28" w:name="_Toc32753_WPSOffice_Level2"/>
+      <w:bookmarkStart w:id="23" w:name="_Toc32753_WPSOffice_Level2"/>
+      <w:bookmarkStart w:id="24" w:name="_Toc152619889"/>
+      <w:bookmarkStart w:id="25" w:name="_Toc19851_WPSOffice_Level2"/>
+      <w:bookmarkStart w:id="26" w:name="_Toc533261391"/>
+      <w:bookmarkStart w:id="27" w:name="_Toc532872738"/>
+      <w:bookmarkStart w:id="28" w:name="_Toc15020_WPSOffice_Level2"/>
     </w:p>
     <w:sdt>
       <w:sdtPr>
@@ -6827,8 +6827,8 @@
       </w:pPr>
       <w:bookmarkStart w:id="29" w:name="_Toc557541547"/>
       <w:bookmarkStart w:id="30" w:name="_Toc1339668345"/>
-      <w:bookmarkStart w:id="31" w:name="_Toc1817611038"/>
-      <w:bookmarkStart w:id="32" w:name="_Toc485224738"/>
+      <w:bookmarkStart w:id="31" w:name="_Toc485224738"/>
+      <w:bookmarkStart w:id="32" w:name="_Toc1817611038"/>
       <w:r>
         <w:rPr>
           <w:rStyle w:val="32"/>
@@ -7560,17 +7560,7 @@
           <w:highlight w:val="none"/>
           <w:lang w:val="en-US" w:eastAsia="zh-CN"/>
         </w:rPr>
-        <w:t>采用金属屏蔽罩进行隔离，</w:t>
-      </w:r>
-      <w:r>
-        <w:rPr>
-          <w:rFonts w:hint="eastAsia" w:ascii="Times New Roman" w:hAnsi="Times New Roman" w:eastAsia="宋体" w:cs="Times New Roman"/>
-          <w:color w:val="auto"/>
-          <w:sz w:val="24"/>
-          <w:highlight w:val="none"/>
-          <w:lang w:val="en-US" w:eastAsia="zh-CN"/>
-        </w:rPr>
-        <w:t>降低环境干扰对测量结果的影响，提高系统稳定性。</w:t>
+        <w:t>采用金属屏蔽罩进行隔离，降低环境干扰对测量结果的影响，提高系统稳定性。</w:t>
       </w:r>
       <w:r>
         <w:rPr>
@@ -7822,6 +7812,7 @@
     <w:p>
       <w:pPr>
         <w:numPr>
+          <w:ilvl w:val="0"/>
           <w:numId w:val="0"/>
         </w:numPr>
         <w:spacing w:line="360" w:lineRule="auto"/>
@@ -8245,10 +8236,10 @@
           <w:lang w:val="en-US" w:eastAsia="zh-CN"/>
         </w:rPr>
       </w:pPr>
-      <w:bookmarkStart w:id="37" w:name="_Toc1694079726"/>
-      <w:bookmarkStart w:id="38" w:name="_Toc782151330"/>
+      <w:bookmarkStart w:id="37" w:name="_Toc1911902896"/>
+      <w:bookmarkStart w:id="38" w:name="_Toc1694079726"/>
       <w:bookmarkStart w:id="39" w:name="_Toc360603249"/>
-      <w:bookmarkStart w:id="40" w:name="_Toc1911902896"/>
+      <w:bookmarkStart w:id="40" w:name="_Toc782151330"/>
       <w:r>
         <w:rPr>
           <w:rStyle w:val="32"/>
@@ -9500,8 +9491,6 @@
           <w:lang w:val="en-US" w:eastAsia="zh-CN"/>
         </w:rPr>
       </w:pPr>
-      <w:bookmarkStart w:id="179" w:name="_GoBack"/>
-      <w:bookmarkEnd w:id="179"/>
     </w:p>
     <w:tbl>
       <w:tblPr>
@@ -12821,9 +12810,9 @@
           <w:lang w:val="en-US" w:eastAsia="zh-CN"/>
         </w:rPr>
       </w:pPr>
-      <w:bookmarkStart w:id="50" w:name="_Toc545742591"/>
-      <w:bookmarkStart w:id="51" w:name="_Toc370997242"/>
-      <w:bookmarkStart w:id="52" w:name="_Toc1709040964"/>
+      <w:bookmarkStart w:id="50" w:name="_Toc370997242"/>
+      <w:bookmarkStart w:id="51" w:name="_Toc1709040964"/>
+      <w:bookmarkStart w:id="52" w:name="_Toc545742591"/>
       <w:r>
         <w:rPr>
           <w:rStyle w:val="32"/>
@@ -14498,9 +14487,9 @@
           <w:lang w:val="en-US" w:eastAsia="zh-CN"/>
         </w:rPr>
       </w:pPr>
-      <w:bookmarkStart w:id="53" w:name="_Toc1205619053"/>
-      <w:bookmarkStart w:id="54" w:name="_Toc1758191273"/>
-      <w:bookmarkStart w:id="55" w:name="_Toc631428913"/>
+      <w:bookmarkStart w:id="53" w:name="_Toc631428913"/>
+      <w:bookmarkStart w:id="54" w:name="_Toc1205619053"/>
+      <w:bookmarkStart w:id="55" w:name="_Toc1758191273"/>
       <w:r>
         <w:rPr>
           <w:rStyle w:val="32"/>
@@ -15821,8 +15810,8 @@
       </w:pPr>
       <w:bookmarkStart w:id="58" w:name="_Toc885498195"/>
       <w:bookmarkStart w:id="59" w:name="_Toc661655261"/>
-      <w:bookmarkStart w:id="60" w:name="_Toc2118569585"/>
-      <w:bookmarkStart w:id="61" w:name="_Toc531996516"/>
+      <w:bookmarkStart w:id="60" w:name="_Toc531996516"/>
+      <w:bookmarkStart w:id="61" w:name="_Toc2118569585"/>
       <w:r>
         <w:rPr>
           <w:rStyle w:val="32"/>
@@ -18892,25 +18881,7 @@
           <w:sz w:val="24"/>
           <w:lang w:val="en-US" w:eastAsia="zh-CN"/>
         </w:rPr>
-        <w:t>在完成机械参数标定以及转换系数计算后，需要进一步对整个测量系统进行</w:t>
-      </w:r>
-      <w:r>
-        <w:rPr>
-          <w:rFonts w:hint="eastAsia" w:hAnsi="DejaVu Math TeX Gyre"/>
-          <w:i w:val="0"/>
-          <w:sz w:val="24"/>
-          <w:lang w:val="en-US" w:eastAsia="zh-CN"/>
-        </w:rPr>
-        <w:t>综合校准</w:t>
-      </w:r>
-      <w:r>
-        <w:rPr>
-          <w:rFonts w:hint="eastAsia" w:hAnsi="DejaVu Math TeX Gyre" w:eastAsia="宋体"/>
-          <w:i w:val="0"/>
-          <w:sz w:val="24"/>
-          <w:lang w:val="en-US" w:eastAsia="zh-CN"/>
-        </w:rPr>
-        <w:t>，以确定实际工作条件下输入电流与系统输出之间的对应关系。由于实际系统中存在磁场分布、线圈参数、光路距离以及电路增益等因素造成的偏差，理论模型与实际输出之间可能存在一定差异，因此需要通过实验数据对系统整体参数进行修正。</w:t>
+        <w:t>在完成机械参数标定以及转换系数计算后，还需要进一步对整个测量系统进行综合校准，以确定系统在实际工作状态下输入电流与最终输出结果之间的对应关系。前述机械参数标定主要用于建立偏转线圈输入电流、机械偏转角以及光斑位移之间的理论关系，而转换系数标定则主要通过实验数据获得 PSD 输出特征量与输入电流之间的转换参数。由于实际系统由电磁转换、机械偏转、光学放大、光电检测、模拟信号调理以及数字采集等多个环节组成，各环节均可能产生一定程度的非理想因素，因此仅依靠理论模型和单独环节的参数标定仍可能存在一定的系统性偏差。为提高最终测量结果的准确性，需要在完整测量链路下进行综合校准。</w:t>
       </w:r>
     </w:p>
     <w:p>
@@ -18926,21 +18897,12 @@
       </w:pPr>
       <w:r>
         <w:rPr>
-          <w:rFonts w:hint="eastAsia" w:hAnsi="DejaVu Math TeX Gyre"/>
-          <w:i w:val="0"/>
-          <w:sz w:val="24"/>
-          <w:lang w:val="en-US" w:eastAsia="zh-CN"/>
-        </w:rPr>
-        <w:t>综合校准</w:t>
-      </w:r>
-      <w:r>
-        <w:rPr>
-          <w:rFonts w:hint="eastAsia" w:hAnsi="DejaVu Math TeX Gyre" w:eastAsia="宋体"/>
-          <w:i w:val="0"/>
-          <w:sz w:val="24"/>
-          <w:lang w:val="en-US" w:eastAsia="zh-CN"/>
-        </w:rPr>
-        <w:t>过程中，利用Arduino产生可控驱动信号，使偏转线圈产生不同大小的输入电流，并同步采集PSD输出数据。实验开始前，首先调整激光器、反射镜以及PSD的位置，使无输入状态下光斑保持在设定零点位置，保证测量系统具有统一初始状态。</w:t>
+          <w:rFonts w:hint="eastAsia" w:hAnsi="DejaVu Math TeX Gyre" w:eastAsia="宋体"/>
+          <w:i w:val="0"/>
+          <w:sz w:val="24"/>
+          <w:lang w:val="en-US" w:eastAsia="zh-CN"/>
+        </w:rPr>
+        <w:t>综合校准的主要目的是将系统各环节实际存在的误差统一反映到最终测量模型中。实际工作过程中，永磁体产生的磁场并非完全均匀，偏转线圈的实际安装位置与理论位置也可能存在一定偏差；同时，悬吊结构的扭转刚度、反射镜安装角度、激光入射方向以及 PSD 与反射镜之间的实际距离均可能与理论设计值存在差异。此外，AD8628 信号调理电路的实际增益、ADS1115 的采样误差以及 PSD 输出特性的变化，也会使实际检测结果与理论计算结果产生偏离。因此，综合校准不再单独考虑某一个参数，而是将整个“输入电流—机械偏转—光学位移—PSD 输出—数字计算”链路作为一个整体进行修正。</w:t>
       </w:r>
     </w:p>
     <w:p>
@@ -18961,7 +18923,7 @@
           <w:sz w:val="24"/>
           <w:lang w:val="en-US" w:eastAsia="zh-CN"/>
         </w:rPr>
-        <w:t>随后，在系统工作范围内设置多个输入电流点，记录对应的PSD输出结果，并通过前文建立的数据转换模型计算系统输出响应。通过多组实验数据与理论计算结果进行对比，获得系统实际工作状态下的修正参数，并将其写入数据处理程序。</w:t>
+        <w:t>综合校准过程中，首先对系统的机械结构和光路进行调整。实验开始前，在偏转线圈不通入输入电流的情况下，对激光器、反射镜以及 PSD 的相对位置进行调整，使反射光斑稳定落在 PSD 预设的零点位置。通过零点调整，可以减小系统初始位置偏差对后续测量结果的影响，同时为不同输入电流条件下的数据比较建立统一的参考基准。在调整过程中，应保证偏转线圈处于自然平衡状态，避免机械结构受到外部拉力或碰撞，从而使系统零点具有较好的重复性。</w:t>
       </w:r>
     </w:p>
     <w:p>
@@ -18977,22 +18939,109 @@
       </w:pPr>
       <w:r>
         <w:rPr>
-          <w:rFonts w:hint="eastAsia" w:hAnsi="DejaVu Math TeX Gyre"/>
-          <w:i w:val="0"/>
-          <w:sz w:val="24"/>
-          <w:lang w:val="en-US" w:eastAsia="zh-CN"/>
-        </w:rPr>
-        <w:t>综合校准</w:t>
-      </w:r>
-      <w:r>
-        <w:rPr>
-          <w:rFonts w:hint="eastAsia" w:hAnsi="DejaVu Math TeX Gyre" w:eastAsia="宋体"/>
-          <w:i w:val="0"/>
-          <w:sz w:val="24"/>
-          <w:lang w:val="en-US" w:eastAsia="zh-CN"/>
-        </w:rPr>
-        <w:t>过程能够进一步补偿机械结构、电磁转换、光学放大以及信号调理电路等多个环节造成的综合误差，使系统输出结果更加接近实际输入值，为后续微弱电信号测量提供准确的转换基础。</w:t>
-      </w:r>
+          <w:rFonts w:hint="eastAsia" w:hAnsi="DejaVu Math TeX Gyre" w:eastAsia="宋体"/>
+          <w:i w:val="0"/>
+          <w:sz w:val="24"/>
+          <w:lang w:val="en-US" w:eastAsia="zh-CN"/>
+        </w:rPr>
+        <w:t>完成零点调整后，利用 Arduino 输出可控的驱动信号，使偏转线圈获得不同大小的实际工作电流。由于 PWM 占空比仅能够表示控制量，不能直接作为标定输入量，因此校准过程中仍以采样电阻测得的实际线圈电流作为输入参考。通过改变 Arduino 输出的 PWM 参数，在系统允许的工作范围内依次设置多个输入电流点。每改变一次输入条件后，等待偏转结构达到稳定状态，再由 PSD、AD8628、ADS1115 以及 Arduino 构成的数据采集链路同步采集系统输出数据。</w:t>
+      </w:r>
+    </w:p>
+    <w:p>
+      <w:pPr>
+        <w:spacing w:line="360" w:lineRule="auto"/>
+        <w:ind w:firstLine="480" w:firstLineChars="200"/>
+        <w:rPr>
+          <w:rFonts w:hint="eastAsia" w:hAnsi="DejaVu Math TeX Gyre" w:eastAsia="宋体"/>
+          <w:i w:val="0"/>
+          <w:sz w:val="24"/>
+          <w:lang w:val="en-US" w:eastAsia="zh-CN"/>
+        </w:rPr>
+      </w:pPr>
+      <w:r>
+        <w:rPr>
+          <w:rFonts w:hint="eastAsia" w:hAnsi="DejaVu Math TeX Gyre" w:eastAsia="宋体"/>
+          <w:i w:val="0"/>
+          <w:sz w:val="24"/>
+          <w:lang w:val="en-US" w:eastAsia="zh-CN"/>
+        </w:rPr>
+        <w:t>对于每一个输入电流点，连续采集一定数量的数据，并对采样结果进行平均或数字滤波，以降低随机噪声和机械微振动造成的瞬时波动。随后，根据前文建立的数据处理模型，将 PSD 输出转换为对应的系统输出响应。对于采用归一化位置算子进行处理的测量模型，可根据两路 PSD 输出计算归一化结果，并进一步利用已经获得的转换系数计算系统对应的感应电流。通过这种方式，可以得到一组“实际输入电流—系统计算输出电流”的实验数据。</w:t>
+      </w:r>
+    </w:p>
+    <w:p>
+      <w:pPr>
+        <w:spacing w:line="360" w:lineRule="auto"/>
+        <w:ind w:firstLine="480" w:firstLineChars="200"/>
+        <w:rPr>
+          <w:rFonts w:hint="eastAsia" w:hAnsi="DejaVu Math TeX Gyre" w:eastAsia="宋体"/>
+          <w:i w:val="0"/>
+          <w:sz w:val="24"/>
+          <w:lang w:val="en-US" w:eastAsia="zh-CN"/>
+        </w:rPr>
+      </w:pPr>
+      <w:r>
+        <w:rPr>
+          <w:rFonts w:hint="eastAsia" w:hAnsi="DejaVu Math TeX Gyre" w:eastAsia="宋体"/>
+          <w:i w:val="0"/>
+          <w:sz w:val="24"/>
+          <w:lang w:val="en-US" w:eastAsia="zh-CN"/>
+        </w:rPr>
+        <w:t>在获得多组实验数据后，将系统计算得到的输出值与实际输入参考值进行逐点比较。若系统输出与实际输入之间存在稳定的比例偏差，可通过修正转换系数对系统进行补偿；若存在较为明显的固定偏移，则进一步调整系统零点修正项。对于工作范围内存在的轻微非线性，也可以通过增加校准点数量分析其变化规律，并判断该偏差是否来源于机械偏转范围、磁场分布或者光学结构等因素。综合校准所得到的修正参数最终写入数据处理程序，使系统在实际测量过程中能够直接利用经过修正的转换模型输出测量结果。</w:t>
+      </w:r>
+    </w:p>
+    <w:p>
+      <w:pPr>
+        <w:spacing w:line="360" w:lineRule="auto"/>
+        <w:ind w:firstLine="480" w:firstLineChars="200"/>
+        <w:rPr>
+          <w:rFonts w:hint="eastAsia" w:hAnsi="DejaVu Math TeX Gyre" w:eastAsia="宋体"/>
+          <w:i w:val="0"/>
+          <w:sz w:val="24"/>
+          <w:lang w:val="en-US" w:eastAsia="zh-CN"/>
+        </w:rPr>
+      </w:pPr>
+      <w:r>
+        <w:rPr>
+          <w:rFonts w:hint="eastAsia" w:hAnsi="DejaVu Math TeX Gyre" w:eastAsia="宋体"/>
+          <w:i w:val="0"/>
+          <w:sz w:val="24"/>
+          <w:lang w:val="en-US" w:eastAsia="zh-CN"/>
+        </w:rPr>
+        <w:t>综合校准完成后，还需要对校准结果进行重复验证。保持已经确定的校准参数不变，再次设置若干已知输入电流点，并将系统计算结果与实际输入值进行比较。若重复测试结果与参考输入值保持较小偏差，说明综合校准参数具有较好的稳定性；若不同测试过程中出现较大的结果变化，则需要进一步检查光斑零点、机械结构、输入电流稳定性以及 PSD 输出等环节。</w:t>
+      </w:r>
+    </w:p>
+    <w:p>
+      <w:pPr>
+        <w:spacing w:line="360" w:lineRule="auto"/>
+        <w:ind w:firstLine="480" w:firstLineChars="200"/>
+        <w:rPr>
+          <w:rFonts w:hint="eastAsia" w:hAnsi="DejaVu Math TeX Gyre" w:eastAsia="宋体"/>
+          <w:i w:val="0"/>
+          <w:sz w:val="24"/>
+          <w:lang w:val="en-US" w:eastAsia="zh-CN"/>
+        </w:rPr>
+      </w:pPr>
+      <w:r>
+        <w:rPr>
+          <w:rFonts w:hint="eastAsia" w:hAnsi="DejaVu Math TeX Gyre" w:eastAsia="宋体"/>
+          <w:i w:val="0"/>
+          <w:sz w:val="24"/>
+          <w:lang w:val="en-US" w:eastAsia="zh-CN"/>
+        </w:rPr>
+        <w:t>因此，系统综合校准不仅是对前述理论模型和转换系数的进一步修正，也是对整个测量链路的一次整体性能校验。通过在实际工作条件下对输入与输出之间的对应关系进行实验修正，可以综合补偿机械结构、电磁转换、光学放大、光电检测以及信号调理等多个环节产生的误差，使系统最终输出更加接近实际输入值，为后续微弱电信号的定量测量提供可靠的转换基础。</w:t>
+      </w:r>
+    </w:p>
+    <w:p>
+      <w:pPr>
+        <w:spacing w:line="360" w:lineRule="auto"/>
+        <w:ind w:firstLine="480" w:firstLineChars="200"/>
+        <w:rPr>
+          <w:rFonts w:hint="eastAsia" w:hAnsi="DejaVu Math TeX Gyre" w:eastAsia="宋体"/>
+          <w:i w:val="0"/>
+          <w:sz w:val="24"/>
+          <w:lang w:val="en-US" w:eastAsia="zh-CN"/>
+        </w:rPr>
+      </w:pPr>
     </w:p>
     <w:p>
       <w:pPr>
@@ -19047,7 +19096,7 @@
           <w:sz w:val="24"/>
           <w:lang w:val="en-US" w:eastAsia="zh-CN"/>
         </w:rPr>
-        <w:t>线性度验证用于评价系统经过标定后，输入电流变化与输出响应之间是否保持稳定的比例关系，是衡量系统测量性能的重要指标。</w:t>
+        <w:t>线性度验证用于评价系统经过参数标定和综合校准后，输入电流变化与系统输出响应之间是否保持稳定的比例关系，是衡量测量系统性能以及验证理论模型有效性的重要实验环节。对于本文所设计的测量系统而言，其基本测量过程包括电流产生电磁作用、机械结构发生偏转、反射镜改变激光传播方向以及 PSD 检测光斑位置等多个转换过程。理论分析表明，在小角度偏转条件下，偏转线圈的输入电流与反射光斑位置之间能够保持近似线性关系，因此需要通过实验验证该线性关系在实际工作范围内是否成立。</w:t>
       </w:r>
     </w:p>
     <w:p>
@@ -19068,7 +19117,7 @@
           <w:sz w:val="24"/>
           <w:lang w:val="en-US" w:eastAsia="zh-CN"/>
         </w:rPr>
-        <w:t>实验过程中，在系统标定参数保持不变的条件下，通过Arduino改变偏转线圈输入电流，在设定测量范围内选取多个测试点，记录对应的PSD归一化输出结果以及系统计算得到的感应电流值。</w:t>
+        <w:t>线性度验证实验应在系统综合校准完成后进行，并保持系统的机械结构、光学位置、磁场条件以及数据处理程序中的标定参数不再改变。实验开始前，首先检查激光光斑位置以及系统零点状态，确认光斑处于设定位置后开始测试。随后，在系统规定的工作范围内选择多个具有代表性的输入电流测试点，并按照由小到大的顺序逐步改变偏转线圈中的实际工作电流。每个测试点均应等待机械系统达到相对稳定状态后，再采集对应的 PSD 输出数据。</w:t>
       </w:r>
     </w:p>
     <w:p>
@@ -19089,7 +19138,7 @@
           <w:sz w:val="24"/>
           <w:lang w:val="en-US" w:eastAsia="zh-CN"/>
         </w:rPr>
-        <w:t>根据实验数据绘制输入电流与系统输出响应曲线，并分析各测试点与理论线性关系之间的偏差。若实验数据能够较好地分布在线性关系附近，则说明系统中的电磁转换、机械偏转以及光学检测过程在当前工作范围内具有良好的线性特性，验证了所建立测量模型的有效性。</w:t>
+        <w:t>在每一个测试点处，首先记录采样电阻对应的实际输入电流值，并同步记录 PSD 输出数据。经过环境光补偿和数字滤波后，根据数据转换模型得到对应的系统输出响应。对于采用 PSD 双路输出进行位置归一化处理的系统，可进一步记录归一化位置算子及由其计算得到的感应电流值，从而形成完整的实验数据集。通过多个测试点，可以获得输入电流从低到高变化过程中系统输出响应的变化规律。</w:t>
       </w:r>
     </w:p>
     <w:p>
@@ -19110,8 +19159,146 @@
           <w:sz w:val="24"/>
           <w:lang w:val="en-US" w:eastAsia="zh-CN"/>
         </w:rPr>
-        <w:t>若测试结果出现明显非线性偏离，则需要进一步分析磁场均匀性、线圈运动范围、光学放大结构以及模拟调理电路等因素对系统性能造成的影响。</w:t>
-      </w:r>
+        <w:t>在数据处理过程中，以实际输入电流作为参考量，以系统计算得到的输出电流或 PSD 输出特征量作为响应量，建立输入与输出之间的实验关系曲线。根据理论模型，若系统在当前工作范围内具有良好的线性特性，则实验数据应大致分布于一条直线附近。可通过对实验数据进行线性拟合，获得实际工作条件下的拟合关系，并进一步分析各实验点相对于拟合直线的偏差情况。</w:t>
+      </w:r>
+    </w:p>
+    <w:p>
+      <w:pPr>
+        <w:spacing w:line="360" w:lineRule="auto"/>
+        <w:ind w:firstLine="480" w:firstLineChars="200"/>
+        <w:rPr>
+          <w:rFonts w:hint="eastAsia" w:hAnsi="DejaVu Math TeX Gyre" w:eastAsia="宋体"/>
+          <w:i w:val="0"/>
+          <w:sz w:val="24"/>
+          <w:lang w:val="en-US" w:eastAsia="zh-CN"/>
+        </w:rPr>
+      </w:pPr>
+      <w:r>
+        <w:rPr>
+          <w:rFonts w:hint="eastAsia" w:hAnsi="DejaVu Math TeX Gyre" w:eastAsia="宋体"/>
+          <w:i w:val="0"/>
+          <w:sz w:val="24"/>
+          <w:lang w:val="en-US" w:eastAsia="zh-CN"/>
+        </w:rPr>
+        <w:t>除观察实验数据曲线外，还应比较不同输入电流条件下系统响应的变化是否具有稳定的比例关系。如果输入电流增加相同的幅度能够引起较为稳定的输出变化，则说明系统在该范围内具有较好的线性响应能力。反之，如果随着输入电流增大，输出响应逐渐出现明显的弯曲或变化比例发生改变，则表明系统在该区域可能已经偏离小角度线性工作条件，需要进一步分析产生非线性的原因。</w:t>
+      </w:r>
+    </w:p>
+    <w:p>
+      <w:pPr>
+        <w:spacing w:line="360" w:lineRule="auto"/>
+        <w:ind w:firstLine="480" w:firstLineChars="200"/>
+        <w:rPr>
+          <w:rFonts w:hint="eastAsia" w:hAnsi="DejaVu Math TeX Gyre" w:eastAsia="宋体"/>
+          <w:i w:val="0"/>
+          <w:sz w:val="24"/>
+          <w:lang w:val="en-US" w:eastAsia="zh-CN"/>
+        </w:rPr>
+      </w:pPr>
+      <w:r>
+        <w:rPr>
+          <w:rFonts w:hint="eastAsia" w:hAnsi="DejaVu Math TeX Gyre" w:eastAsia="宋体"/>
+          <w:i w:val="0"/>
+          <w:sz w:val="24"/>
+          <w:lang w:val="en-US" w:eastAsia="zh-CN"/>
+        </w:rPr>
+        <w:t>系统线性度主要受到电磁、机械以及光学三个方面因素的共同影响。首先，若永磁体形成的磁场在偏转线圈运动范围内存在明显的不均匀性，则线圈所受到的安培力可能随位置发生变化，使输入电流与机械偏转之间不再保持理想比例关系。其次，当偏转角度逐渐增大时，悬吊结构的扭转恢复力矩以及机械运动状态可能偏离小角度近似模型，从而产生机械非线性。最后，反射镜和 PSD 构成的光学检测路径同样存在一定的工作范围，当光斑偏移较大时，光学几何关系可能逐渐偏离小角度近似条件，进而影响输出响应。</w:t>
+      </w:r>
+    </w:p>
+    <w:p>
+      <w:pPr>
+        <w:spacing w:line="360" w:lineRule="auto"/>
+        <w:ind w:firstLine="480" w:firstLineChars="200"/>
+        <w:rPr>
+          <w:rFonts w:hint="eastAsia" w:hAnsi="DejaVu Math TeX Gyre" w:eastAsia="宋体"/>
+          <w:i w:val="0"/>
+          <w:sz w:val="24"/>
+          <w:lang w:val="en-US" w:eastAsia="zh-CN"/>
+        </w:rPr>
+      </w:pPr>
+      <w:r>
+        <w:rPr>
+          <w:rFonts w:hint="eastAsia" w:hAnsi="DejaVu Math TeX Gyre" w:eastAsia="宋体"/>
+          <w:i w:val="0"/>
+          <w:sz w:val="24"/>
+          <w:lang w:val="en-US" w:eastAsia="zh-CN"/>
+        </w:rPr>
+        <w:t>此外，PSD、AD8628 以及 ADS1115 等电子器件的实际工作特性也可能对线性度产生影响。当 PSD 输出接近检测范围边界时，其输出信号与光斑位置之间的关系可能发生变化；模拟调理电路的增益和工作范围也会限制系统的有效测量范围。因此，在进行线性度验证时，应优先选择系统稳定工作区间内的测试点，避免因超出器件工作范围而将饱和或边界效应误认为系统整体线性度不足。</w:t>
+      </w:r>
+    </w:p>
+    <w:p>
+      <w:pPr>
+        <w:spacing w:line="360" w:lineRule="auto"/>
+        <w:ind w:firstLine="480" w:firstLineChars="200"/>
+        <w:rPr>
+          <w:rFonts w:hint="eastAsia" w:hAnsi="DejaVu Math TeX Gyre" w:eastAsia="宋体"/>
+          <w:i w:val="0"/>
+          <w:sz w:val="24"/>
+          <w:lang w:val="en-US" w:eastAsia="zh-CN"/>
+        </w:rPr>
+      </w:pPr>
+      <w:r>
+        <w:rPr>
+          <w:rFonts w:hint="eastAsia" w:hAnsi="DejaVu Math TeX Gyre" w:eastAsia="宋体"/>
+          <w:i w:val="0"/>
+          <w:sz w:val="24"/>
+          <w:lang w:val="en-US" w:eastAsia="zh-CN"/>
+        </w:rPr>
+        <w:t>若实验数据能够较好地分布在线性拟合关系附近，且不同测试点的偏差均处于系统允许范围内，则说明经过标定和综合校准后，系统在当前工作区间内能够保持较稳定的输入输出比例关系，验证了前文建立的电磁转换、机械偏转和光学检测模型具有较好的实际适用性。同时，较好的线性响应也意味着系统可以采用较为简单的线性转换模型完成输入电流的定量计算，有利于降低 Arduino 数据处理程序的复杂度。</w:t>
+      </w:r>
+    </w:p>
+    <w:p>
+      <w:pPr>
+        <w:spacing w:line="360" w:lineRule="auto"/>
+        <w:ind w:firstLine="480" w:firstLineChars="200"/>
+        <w:rPr>
+          <w:rFonts w:hint="eastAsia" w:hAnsi="DejaVu Math TeX Gyre" w:eastAsia="宋体"/>
+          <w:i w:val="0"/>
+          <w:sz w:val="24"/>
+          <w:lang w:val="en-US" w:eastAsia="zh-CN"/>
+        </w:rPr>
+      </w:pPr>
+      <w:r>
+        <w:rPr>
+          <w:rFonts w:hint="eastAsia" w:hAnsi="DejaVu Math TeX Gyre" w:eastAsia="宋体"/>
+          <w:i w:val="0"/>
+          <w:sz w:val="24"/>
+          <w:lang w:val="en-US" w:eastAsia="zh-CN"/>
+        </w:rPr>
+        <w:t>若测试结果出现明显的非线性偏离，则应结合实验条件进一步分析其原因。首先检查磁场区域是否均匀以及偏转线圈是否始终处于有效工作区域；其次检查悬吊结构是否存在机械摩擦、安装偏差或恢复力矩变化；同时检查反射镜、激光器和 PSD 的相对位置是否发生变化。此外，还需要检查 AD8628 模拟调理电路以及 ADS1115 采样范围是否存在饱和或有效分辨率不足等问题。通过对上述因素进行逐项排查，可以确定系统非线性主要来源，并为后续优化提供依据。</w:t>
+      </w:r>
+    </w:p>
+    <w:p>
+      <w:pPr>
+        <w:spacing w:line="360" w:lineRule="auto"/>
+        <w:ind w:firstLine="480" w:firstLineChars="200"/>
+        <w:rPr>
+          <w:rFonts w:hint="eastAsia" w:hAnsi="DejaVu Math TeX Gyre" w:eastAsia="宋体"/>
+          <w:i w:val="0"/>
+          <w:sz w:val="24"/>
+          <w:lang w:val="en-US" w:eastAsia="zh-CN"/>
+        </w:rPr>
+      </w:pPr>
+      <w:r>
+        <w:rPr>
+          <w:rFonts w:hint="eastAsia" w:hAnsi="DejaVu Math TeX Gyre" w:eastAsia="宋体"/>
+          <w:i w:val="0"/>
+          <w:sz w:val="24"/>
+          <w:lang w:val="en-US" w:eastAsia="zh-CN"/>
+        </w:rPr>
+        <w:t>通过系统线性度验证，可以进一步确定装置的有效测量范围，并为后续实验中输入信号的选择提供参考。当系统在一定电流范围内表现出良好的线性关系时，可将该范围确定为主要工作区间，并在实际微弱电信号测量过程中尽量保证系统工作于该区域内，从而获得更加稳定和可靠的测量结果。</w:t>
+      </w:r>
+    </w:p>
+    <w:p>
+      <w:pPr>
+        <w:spacing w:line="360" w:lineRule="auto"/>
+        <w:ind w:firstLine="480" w:firstLineChars="200"/>
+        <w:rPr>
+          <w:rFonts w:hint="eastAsia" w:hAnsi="DejaVu Math TeX Gyre" w:eastAsia="宋体"/>
+          <w:i w:val="0"/>
+          <w:sz w:val="24"/>
+          <w:lang w:val="en-US" w:eastAsia="zh-CN"/>
+        </w:rPr>
+      </w:pPr>
     </w:p>
     <w:p>
       <w:pPr>
@@ -19920,9 +20107,9 @@
         </w:rPr>
         <w:t>在系统运行过程中，还需要建立规范化的校准流程。实验开始前应完成光路调整和零点校准，并在长时间测量过程中定期检查系统基准状态，以减少温度变化、器件老化以及环境变化造成的长期漂移。通过上述优化措施，可以进一步提高系统测量精度和长期稳定性。</w:t>
       </w:r>
-      <w:bookmarkStart w:id="100" w:name="_Toc1330000403"/>
+      <w:bookmarkStart w:id="100" w:name="_Toc832526828"/>
       <w:bookmarkStart w:id="101" w:name="_Toc1758232525"/>
-      <w:bookmarkStart w:id="102" w:name="_Toc832526828"/>
+      <w:bookmarkStart w:id="102" w:name="_Toc1330000403"/>
     </w:p>
     <w:p>
       <w:pPr>
@@ -20324,8 +20511,8 @@
           <w:lang w:val="en-US" w:eastAsia="zh-CN"/>
         </w:rPr>
       </w:pPr>
-      <w:bookmarkStart w:id="109" w:name="_Toc1456444498"/>
-      <w:bookmarkStart w:id="110" w:name="_Toc819215310"/>
+      <w:bookmarkStart w:id="109" w:name="_Toc819215310"/>
+      <w:bookmarkStart w:id="110" w:name="_Toc1456444498"/>
       <w:bookmarkStart w:id="111" w:name="_Toc1914732907"/>
       <w:bookmarkStart w:id="112" w:name="_Toc219693208"/>
       <w:r>
@@ -21816,7 +22003,7 @@
           <w:highlight w:val="none"/>
           <w:lang w:val="en-US" w:eastAsia="zh-CN"/>
         </w:rPr>
-        <w:t>本文设计了一套基于电磁感应、磁电转换和光学放大原理的微弱电信号测量系统。针对传统微弱信号检测过程中信号幅值低、直接测量困难的问题，系统采用空间电磁感应方式获取外部微弱信号，并利用载流线圈在恒定磁场中的受力作用，将微小电流转换为机械偏转，再通过光杠杆结构将难以直接观测的角位移转换为PSD表面的光斑位置变化，实现了微弱电信号由物理量到数字量的转换。</w:t>
+        <w:t>本文设计了一套基于电磁感应、磁电转换和光学放大原理的微弱电信号测量系统。针对传统微弱信号检测过程中信号幅值低、直接测量困难的问题，系统采用空间电磁感应方式获取外部微弱信号，并利用载流线圈在恒定磁场中的受力作用，将微小电流转换为机械偏转，再通过光杠杆结构将难以直接观测的角位移转换为PSD表面的光斑位置变化，实现了微弱电信号由物理量到数字量的转换。通过机械、光学与电子检测环节的逐级转换，实现了对微弱信号的间接放大与测量。</w:t>
       </w:r>
     </w:p>
     <w:p>
@@ -21874,7 +22061,7 @@
           <w:highlight w:val="none"/>
           <w:lang w:val="en-US" w:eastAsia="zh-CN"/>
         </w:rPr>
-        <w:t>在信号检测与处理方面，系统利用PSD完成光斑位置检测，并结合AD8628模拟调理电路、ADS1115模数转换模块以及Arduino控制单元，实现了从光学位移信号到数字测量结果的转换。通过对PSD两路输出信号进行处理，计算得到对应归一化算子，并结合专用标定模块获得的转换参数，实现了归一化算子与输入电流之间的定量对应关系。</w:t>
+        <w:t>在信号检测与处理方面，系统利用PSD完成光斑位置检测，并结合AD8628模拟调理电路、ADS1115模数转换模块以及Arduino控制单元，实现了从光学位移信号到数字测量结果的转换。通过对PSD两路输出信号进行处理，计算得到对应归一化算子，并结合专用标定模块获得的转换参数，实现了归一化算子与输入电流之间的定量对应关系。同时，通过环境光补偿和数据滤波等处理，降低了外界干扰对测量结果的影响。</w:t>
       </w:r>
     </w:p>
     <w:p>
@@ -21934,24 +22121,8 @@
         </w:rPr>
         <w:t>总体而言，本系统建立了一种“电信号—机械偏转—光学位移—数字输出”的多级转换测量方法，将物理放大结构与数字信号处理技术相结合，实现了微弱电信号的间接检测与量化分析。该系统具有结构简单、原理直观以及实验可重复性较好的特点，可作为微弱信号检测实验和相关物理研究的平台。</w:t>
       </w:r>
-    </w:p>
-    <w:p>
-      <w:pPr>
-        <w:numPr>
-          <w:ilvl w:val="0"/>
-          <w:numId w:val="0"/>
-        </w:numPr>
-        <w:spacing w:line="360" w:lineRule="auto"/>
-        <w:jc w:val="left"/>
-        <w:outlineLvl w:val="2"/>
-        <w:rPr>
-          <w:rFonts w:hint="eastAsia" w:ascii="Times New Roman" w:hAnsi="Times New Roman" w:eastAsia="宋体" w:cs="Times New Roman"/>
-          <w:color w:val="auto"/>
-          <w:sz w:val="24"/>
-          <w:highlight w:val="none"/>
-          <w:lang w:val="en-US" w:eastAsia="zh-CN"/>
-        </w:rPr>
-      </w:pPr>
+      <w:bookmarkStart w:id="179" w:name="_GoBack"/>
+      <w:bookmarkEnd w:id="179"/>
     </w:p>
     <w:p>
       <w:pPr>
@@ -22719,10 +22890,10 @@
           <w:lang w:val="en-US" w:eastAsia="zh-CN"/>
         </w:rPr>
       </w:pPr>
-      <w:bookmarkStart w:id="147" w:name="_Toc1893601312"/>
+      <w:bookmarkStart w:id="147" w:name="_Toc1988800887"/>
       <w:bookmarkStart w:id="148" w:name="_Toc231621070"/>
       <w:bookmarkStart w:id="149" w:name="_Toc461027638"/>
-      <w:bookmarkStart w:id="150" w:name="_Toc1988800887"/>
+      <w:bookmarkStart w:id="150" w:name="_Toc1893601312"/>
       <w:r>
         <w:rPr>
           <w:rFonts w:hint="eastAsia" w:ascii="Times New Roman" w:hAnsi="Times New Roman" w:eastAsia="黑体" w:cs="Times New Roman"/>
@@ -22795,9 +22966,9 @@
           <w:lang w:val="en-US" w:eastAsia="zh-CN"/>
         </w:rPr>
       </w:pPr>
-      <w:bookmarkStart w:id="155" w:name="_Toc1574421420"/>
-      <w:bookmarkStart w:id="156" w:name="_Toc1665133777"/>
-      <w:bookmarkStart w:id="157" w:name="_Toc441259872"/>
+      <w:bookmarkStart w:id="155" w:name="_Toc441259872"/>
+      <w:bookmarkStart w:id="156" w:name="_Toc1574421420"/>
+      <w:bookmarkStart w:id="157" w:name="_Toc1665133777"/>
       <w:bookmarkStart w:id="158" w:name="_Toc504988249"/>
       <w:r>
         <w:rPr>
@@ -22979,10 +23150,10 @@
           <w:lang w:val="en-US" w:eastAsia="zh-CN"/>
         </w:rPr>
       </w:pPr>
-      <w:bookmarkStart w:id="163" w:name="_Toc412366163"/>
-      <w:bookmarkStart w:id="164" w:name="_Toc669479062"/>
+      <w:bookmarkStart w:id="163" w:name="_Toc669479062"/>
+      <w:bookmarkStart w:id="164" w:name="_Toc2123982062"/>
       <w:bookmarkStart w:id="165" w:name="_Toc1200908619"/>
-      <w:bookmarkStart w:id="166" w:name="_Toc2123982062"/>
+      <w:bookmarkStart w:id="166" w:name="_Toc412366163"/>
       <w:r>
         <w:rPr>
           <w:rFonts w:hint="eastAsia" w:ascii="Times New Roman" w:hAnsi="Times New Roman" w:eastAsia="黑体" w:cs="Times New Roman"/>
@@ -23098,8 +23269,8 @@
       </w:pPr>
       <w:bookmarkStart w:id="167" w:name="_Toc145851953"/>
       <w:bookmarkStart w:id="168" w:name="_Toc1619845027"/>
-      <w:bookmarkStart w:id="169" w:name="_Toc1267768401"/>
-      <w:bookmarkStart w:id="170" w:name="_Toc708372672"/>
+      <w:bookmarkStart w:id="169" w:name="_Toc708372672"/>
+      <w:bookmarkStart w:id="170" w:name="_Toc1267768401"/>
       <w:r>
         <w:rPr>
           <w:rFonts w:hint="eastAsia" w:ascii="Times New Roman" w:hAnsi="Times New Roman" w:eastAsia="黑体" w:cs="Times New Roman"/>
@@ -23159,10 +23330,10 @@
           <w:lang w:val="en-US" w:eastAsia="zh-CN"/>
         </w:rPr>
       </w:pPr>
-      <w:bookmarkStart w:id="171" w:name="_Toc50770073"/>
-      <w:bookmarkStart w:id="172" w:name="_Toc1085175770"/>
-      <w:bookmarkStart w:id="173" w:name="_Toc2117642983"/>
-      <w:bookmarkStart w:id="174" w:name="_Toc1054932844"/>
+      <w:bookmarkStart w:id="171" w:name="_Toc1085175770"/>
+      <w:bookmarkStart w:id="172" w:name="_Toc50770073"/>
+      <w:bookmarkStart w:id="173" w:name="_Toc1054932844"/>
+      <w:bookmarkStart w:id="174" w:name="_Toc2117642983"/>
       <w:r>
         <w:rPr>
           <w:rFonts w:hint="eastAsia" w:ascii="Times New Roman" w:hAnsi="Times New Roman" w:eastAsia="黑体" w:cs="Times New Roman"/>
@@ -23281,8 +23452,8 @@
           <w:lang w:val="en-US" w:eastAsia="zh-CN"/>
         </w:rPr>
       </w:pPr>
-      <w:bookmarkStart w:id="175" w:name="_Toc2118036066"/>
-      <w:bookmarkStart w:id="176" w:name="_Toc631319476"/>
+      <w:bookmarkStart w:id="175" w:name="_Toc631319476"/>
+      <w:bookmarkStart w:id="176" w:name="_Toc2118036066"/>
       <w:bookmarkStart w:id="177" w:name="_Toc979133550"/>
       <w:bookmarkStart w:id="178" w:name="_Toc741609052"/>
       <w:r>

</xml_diff>